<commit_message>
control flow training 1
</commit_message>
<xml_diff>
--- a/out/production/core-java-training/Chapter3/CH3.docx
+++ b/out/production/core-java-training/Chapter3/CH3.docx
@@ -105,18 +105,6 @@
       <w:pPr>
         <w:pStyle w:val="ListParagraph"/>
       </w:pPr>
-    </w:p>
-    <w:p>
-      <w:pPr>
-        <w:pStyle w:val="ListParagraph"/>
-        <w:numPr>
-          <w:ilvl w:val="0"/>
-          <w:numId w:val="9"/>
-        </w:numPr>
-      </w:pPr>
-      <w:r>
-        <w:t>Control Flow</w:t>
-      </w:r>
     </w:p>
     <w:p>
       <w:pPr>
@@ -500,20 +488,7 @@
         <w:t xml:space="preserve"> “</w:t>
       </w:r>
       <w:r>
-        <w:t xml:space="preserve">Type mismatch: cannot convert from String to </w:t>
-      </w:r>
-      <w:proofErr w:type="spellStart"/>
-      <w:proofErr w:type="gramStart"/>
-      <w:r>
-        <w:t>intJava</w:t>
-      </w:r>
-      <w:proofErr w:type="spellEnd"/>
-      <w:r>
-        <w:t>(</w:t>
-      </w:r>
-      <w:proofErr w:type="gramEnd"/>
-      <w:r>
-        <w:t>16777233)</w:t>
+        <w:t>Type mismatch: cannot convert from String to intJava(16777233)</w:t>
       </w:r>
       <w:r>
         <w:t>” Error.</w:t>
@@ -1490,21 +1465,12 @@
         <w:pStyle w:val="ListParagraph"/>
         <w:ind w:left="1854"/>
       </w:pPr>
-      <w:proofErr w:type="spellStart"/>
-      <w:r>
-        <w:rPr>
-          <w:b/>
-          <w:bCs/>
-        </w:rPr>
-        <w:t>BigDecimal</w:t>
-      </w:r>
-      <w:proofErr w:type="spellEnd"/>
-      <w:r>
-        <w:rPr>
-          <w:b/>
-          <w:bCs/>
-        </w:rPr>
-        <w:t xml:space="preserve"> </w:t>
+      <w:r>
+        <w:rPr>
+          <w:b/>
+          <w:bCs/>
+        </w:rPr>
+        <w:t xml:space="preserve">BigDecimal </w:t>
       </w:r>
       <w:r>
         <w:t>stores decimal numbers with arbitrary precision, avoiding the rounding errors that can occur with float and double.</w:t>
@@ -2268,23 +2234,7 @@
           <w:sz w:val="24"/>
           <w:szCs w:val="24"/>
         </w:rPr>
-        <w:t>when you create a string using a literal, like String name = "Java</w:t>
-      </w:r>
-      <w:proofErr w:type="gramStart"/>
-      <w:r>
-        <w:rPr>
-          <w:sz w:val="24"/>
-          <w:szCs w:val="24"/>
-        </w:rPr>
-        <w:t>";,</w:t>
-      </w:r>
-      <w:proofErr w:type="gramEnd"/>
-      <w:r>
-        <w:rPr>
-          <w:sz w:val="24"/>
-          <w:szCs w:val="24"/>
-        </w:rPr>
-        <w:t xml:space="preserve"> allowing Java to reuse existing string objects and save memory. Java stores strings in the </w:t>
+        <w:t xml:space="preserve">when you create a string using a literal, like String name = "Java";, allowing Java to reuse existing string objects and save memory. Java stores strings in the </w:t>
       </w:r>
       <w:r>
         <w:rPr>
@@ -2300,39 +2250,7 @@
           <w:sz w:val="24"/>
           <w:szCs w:val="24"/>
         </w:rPr>
-        <w:t xml:space="preserve"> when you create them using new, like String name = new </w:t>
-      </w:r>
-      <w:proofErr w:type="gramStart"/>
-      <w:r>
-        <w:rPr>
-          <w:sz w:val="24"/>
-          <w:szCs w:val="24"/>
-        </w:rPr>
-        <w:t>String(</w:t>
-      </w:r>
-      <w:proofErr w:type="gramEnd"/>
-      <w:r>
-        <w:rPr>
-          <w:sz w:val="24"/>
-          <w:szCs w:val="24"/>
-        </w:rPr>
-        <w:t>"Java"</w:t>
-      </w:r>
-      <w:proofErr w:type="gramStart"/>
-      <w:r>
-        <w:rPr>
-          <w:sz w:val="24"/>
-          <w:szCs w:val="24"/>
-        </w:rPr>
-        <w:t>);,</w:t>
-      </w:r>
-      <w:proofErr w:type="gramEnd"/>
-      <w:r>
-        <w:rPr>
-          <w:sz w:val="24"/>
-          <w:szCs w:val="24"/>
-        </w:rPr>
-        <w:t xml:space="preserve"> which creates a separate string object even if the same value already exists in the pool.</w:t>
+        <w:t xml:space="preserve"> when you create them using new, like String name = new String("Java");, which creates a separate string object even if the same value already exists in the pool.</w:t>
       </w:r>
     </w:p>
     <w:p>
@@ -2416,7 +2334,6 @@
           <w:szCs w:val="24"/>
         </w:rPr>
       </w:pPr>
-      <w:proofErr w:type="spellStart"/>
       <w:r>
         <w:rPr>
           <w:b/>
@@ -2426,47 +2343,21 @@
         </w:rPr>
         <w:t>StringBuffer</w:t>
       </w:r>
-      <w:proofErr w:type="spellEnd"/>
-    </w:p>
-    <w:p>
-      <w:pPr>
-        <w:pStyle w:val="ListParagraph"/>
-        <w:rPr>
-          <w:sz w:val="24"/>
-          <w:szCs w:val="24"/>
-        </w:rPr>
-      </w:pPr>
-      <w:proofErr w:type="spellStart"/>
-      <w:r>
-        <w:rPr>
-          <w:sz w:val="24"/>
-          <w:szCs w:val="24"/>
-        </w:rPr>
-        <w:t>StringBuffer</w:t>
-      </w:r>
-      <w:proofErr w:type="spellEnd"/>
-      <w:r>
-        <w:rPr>
-          <w:sz w:val="24"/>
-          <w:szCs w:val="24"/>
-        </w:rPr>
-        <w:t xml:space="preserve"> is similar to StringBuilder because it also allows strings to be modified without creating new objects. The difference is that </w:t>
-      </w:r>
-      <w:proofErr w:type="spellStart"/>
-      <w:r>
-        <w:rPr>
-          <w:sz w:val="24"/>
-          <w:szCs w:val="24"/>
-        </w:rPr>
-        <w:t>StringBuffer</w:t>
-      </w:r>
-      <w:proofErr w:type="spellEnd"/>
-      <w:r>
-        <w:rPr>
-          <w:sz w:val="24"/>
-          <w:szCs w:val="24"/>
-        </w:rPr>
-        <w:t xml:space="preserve"> is </w:t>
+    </w:p>
+    <w:p>
+      <w:pPr>
+        <w:pStyle w:val="ListParagraph"/>
+        <w:rPr>
+          <w:sz w:val="24"/>
+          <w:szCs w:val="24"/>
+        </w:rPr>
+      </w:pPr>
+      <w:r>
+        <w:rPr>
+          <w:sz w:val="24"/>
+          <w:szCs w:val="24"/>
+        </w:rPr>
+        <w:t xml:space="preserve">StringBuffer is similar to StringBuilder because it also allows strings to be modified without creating new objects. The difference is that StringBuffer is </w:t>
       </w:r>
       <w:r>
         <w:rPr>
@@ -2657,21 +2548,12 @@
                 <w:szCs w:val="24"/>
               </w:rPr>
             </w:pPr>
-            <w:proofErr w:type="gramStart"/>
-            <w:r>
-              <w:rPr>
-                <w:sz w:val="24"/>
-                <w:szCs w:val="24"/>
-              </w:rPr>
-              <w:t>length(</w:t>
-            </w:r>
-            <w:proofErr w:type="gramEnd"/>
-            <w:r>
-              <w:rPr>
-                <w:sz w:val="24"/>
-                <w:szCs w:val="24"/>
-              </w:rPr>
-              <w:t>)</w:t>
+            <w:r>
+              <w:rPr>
+                <w:sz w:val="24"/>
+                <w:szCs w:val="24"/>
+              </w:rPr>
+              <w:t>length()</w:t>
             </w:r>
           </w:p>
         </w:tc>
@@ -2719,32 +2601,7 @@
                 <w:sz w:val="24"/>
                 <w:szCs w:val="24"/>
               </w:rPr>
-              <w:t>"</w:t>
-            </w:r>
-            <w:proofErr w:type="spellStart"/>
-            <w:r>
-              <w:rPr>
-                <w:sz w:val="24"/>
-                <w:szCs w:val="24"/>
-              </w:rPr>
-              <w:t>Java</w:t>
-            </w:r>
-            <w:proofErr w:type="gramStart"/>
-            <w:r>
-              <w:rPr>
-                <w:sz w:val="24"/>
-                <w:szCs w:val="24"/>
-              </w:rPr>
-              <w:t>".length</w:t>
-            </w:r>
-            <w:proofErr w:type="spellEnd"/>
-            <w:proofErr w:type="gramEnd"/>
-            <w:r>
-              <w:rPr>
-                <w:sz w:val="24"/>
-                <w:szCs w:val="24"/>
-              </w:rPr>
-              <w:t>()</w:t>
+              <w:t>"Java".length()</w:t>
             </w:r>
           </w:p>
         </w:tc>
@@ -2789,21 +2646,12 @@
                 <w:szCs w:val="24"/>
               </w:rPr>
             </w:pPr>
-            <w:proofErr w:type="spellStart"/>
-            <w:r>
-              <w:rPr>
-                <w:sz w:val="24"/>
-                <w:szCs w:val="24"/>
-              </w:rPr>
-              <w:t>charAt</w:t>
-            </w:r>
-            <w:proofErr w:type="spellEnd"/>
-            <w:r>
-              <w:rPr>
-                <w:sz w:val="24"/>
-                <w:szCs w:val="24"/>
-              </w:rPr>
-              <w:t>(index)</w:t>
+            <w:r>
+              <w:rPr>
+                <w:sz w:val="24"/>
+                <w:szCs w:val="24"/>
+              </w:rPr>
+              <w:t>charAt(index)</w:t>
             </w:r>
           </w:p>
         </w:tc>
@@ -2851,32 +2699,7 @@
                 <w:sz w:val="24"/>
                 <w:szCs w:val="24"/>
               </w:rPr>
-              <w:t>"Java</w:t>
-            </w:r>
-            <w:proofErr w:type="gramStart"/>
-            <w:r>
-              <w:rPr>
-                <w:sz w:val="24"/>
-                <w:szCs w:val="24"/>
-              </w:rPr>
-              <w:t>".</w:t>
-            </w:r>
-            <w:proofErr w:type="spellStart"/>
-            <w:r>
-              <w:rPr>
-                <w:sz w:val="24"/>
-                <w:szCs w:val="24"/>
-              </w:rPr>
-              <w:t>charAt</w:t>
-            </w:r>
-            <w:proofErr w:type="spellEnd"/>
-            <w:proofErr w:type="gramEnd"/>
-            <w:r>
-              <w:rPr>
-                <w:sz w:val="24"/>
-                <w:szCs w:val="24"/>
-              </w:rPr>
-              <w:t>(2)</w:t>
+              <w:t>"Java".charAt(2)</w:t>
             </w:r>
           </w:p>
         </w:tc>
@@ -2977,32 +2800,7 @@
                 <w:sz w:val="24"/>
                 <w:szCs w:val="24"/>
               </w:rPr>
-              <w:t>"</w:t>
-            </w:r>
-            <w:proofErr w:type="spellStart"/>
-            <w:r>
-              <w:rPr>
-                <w:sz w:val="24"/>
-                <w:szCs w:val="24"/>
-              </w:rPr>
-              <w:t>Programming</w:t>
-            </w:r>
-            <w:proofErr w:type="gramStart"/>
-            <w:r>
-              <w:rPr>
-                <w:sz w:val="24"/>
-                <w:szCs w:val="24"/>
-              </w:rPr>
-              <w:t>".substring</w:t>
-            </w:r>
-            <w:proofErr w:type="spellEnd"/>
-            <w:proofErr w:type="gramEnd"/>
-            <w:r>
-              <w:rPr>
-                <w:sz w:val="24"/>
-                <w:szCs w:val="24"/>
-              </w:rPr>
-              <w:t>(3)</w:t>
+              <w:t>"Programming".substring(3)</w:t>
             </w:r>
           </w:p>
         </w:tc>
@@ -3021,7 +2819,6 @@
                 <w:szCs w:val="24"/>
               </w:rPr>
             </w:pPr>
-            <w:proofErr w:type="spellStart"/>
             <w:r>
               <w:rPr>
                 <w:sz w:val="24"/>
@@ -3029,7 +2826,6 @@
               </w:rPr>
               <w:t>gramming</w:t>
             </w:r>
-            <w:proofErr w:type="spellEnd"/>
           </w:p>
         </w:tc>
       </w:tr>
@@ -3049,21 +2845,12 @@
                 <w:szCs w:val="24"/>
               </w:rPr>
             </w:pPr>
-            <w:proofErr w:type="gramStart"/>
-            <w:r>
-              <w:rPr>
-                <w:sz w:val="24"/>
-                <w:szCs w:val="24"/>
-              </w:rPr>
-              <w:t>substring(</w:t>
-            </w:r>
-            <w:proofErr w:type="gramEnd"/>
-            <w:r>
-              <w:rPr>
-                <w:sz w:val="24"/>
-                <w:szCs w:val="24"/>
-              </w:rPr>
-              <w:t>start, end)</w:t>
+            <w:r>
+              <w:rPr>
+                <w:sz w:val="24"/>
+                <w:szCs w:val="24"/>
+              </w:rPr>
+              <w:t>substring(start, end)</w:t>
             </w:r>
           </w:p>
         </w:tc>
@@ -3111,32 +2898,7 @@
                 <w:sz w:val="24"/>
                 <w:szCs w:val="24"/>
               </w:rPr>
-              <w:t>"</w:t>
-            </w:r>
-            <w:proofErr w:type="spellStart"/>
-            <w:r>
-              <w:rPr>
-                <w:sz w:val="24"/>
-                <w:szCs w:val="24"/>
-              </w:rPr>
-              <w:t>Programming</w:t>
-            </w:r>
-            <w:proofErr w:type="gramStart"/>
-            <w:r>
-              <w:rPr>
-                <w:sz w:val="24"/>
-                <w:szCs w:val="24"/>
-              </w:rPr>
-              <w:t>".substring</w:t>
-            </w:r>
-            <w:proofErr w:type="spellEnd"/>
-            <w:proofErr w:type="gramEnd"/>
-            <w:r>
-              <w:rPr>
-                <w:sz w:val="24"/>
-                <w:szCs w:val="24"/>
-              </w:rPr>
-              <w:t>(3,7)</w:t>
+              <w:t>"Programming".substring(3,7)</w:t>
             </w:r>
           </w:p>
         </w:tc>
@@ -3184,30 +2946,12 @@
                 <w:szCs w:val="24"/>
               </w:rPr>
             </w:pPr>
-            <w:proofErr w:type="spellStart"/>
-            <w:proofErr w:type="gramStart"/>
-            <w:r>
-              <w:rPr>
-                <w:sz w:val="24"/>
-                <w:szCs w:val="24"/>
-              </w:rPr>
-              <w:t>toUpperCase</w:t>
-            </w:r>
-            <w:proofErr w:type="spellEnd"/>
-            <w:r>
-              <w:rPr>
-                <w:sz w:val="24"/>
-                <w:szCs w:val="24"/>
-              </w:rPr>
-              <w:t>(</w:t>
-            </w:r>
-            <w:proofErr w:type="gramEnd"/>
-            <w:r>
-              <w:rPr>
-                <w:sz w:val="24"/>
-                <w:szCs w:val="24"/>
-              </w:rPr>
-              <w:t>)</w:t>
+            <w:r>
+              <w:rPr>
+                <w:sz w:val="24"/>
+                <w:szCs w:val="24"/>
+              </w:rPr>
+              <w:t>toUpperCase()</w:t>
             </w:r>
           </w:p>
         </w:tc>
@@ -3255,32 +2999,7 @@
                 <w:sz w:val="24"/>
                 <w:szCs w:val="24"/>
               </w:rPr>
-              <w:t>"java</w:t>
-            </w:r>
-            <w:proofErr w:type="gramStart"/>
-            <w:r>
-              <w:rPr>
-                <w:sz w:val="24"/>
-                <w:szCs w:val="24"/>
-              </w:rPr>
-              <w:t>".</w:t>
-            </w:r>
-            <w:proofErr w:type="spellStart"/>
-            <w:r>
-              <w:rPr>
-                <w:sz w:val="24"/>
-                <w:szCs w:val="24"/>
-              </w:rPr>
-              <w:t>toUpperCase</w:t>
-            </w:r>
-            <w:proofErr w:type="spellEnd"/>
-            <w:proofErr w:type="gramEnd"/>
-            <w:r>
-              <w:rPr>
-                <w:sz w:val="24"/>
-                <w:szCs w:val="24"/>
-              </w:rPr>
-              <w:t>()</w:t>
+              <w:t>"java".toUpperCase()</w:t>
             </w:r>
           </w:p>
         </w:tc>
@@ -3325,30 +3044,12 @@
                 <w:szCs w:val="24"/>
               </w:rPr>
             </w:pPr>
-            <w:proofErr w:type="spellStart"/>
-            <w:proofErr w:type="gramStart"/>
-            <w:r>
-              <w:rPr>
-                <w:sz w:val="24"/>
-                <w:szCs w:val="24"/>
-              </w:rPr>
-              <w:t>toLowerCase</w:t>
-            </w:r>
-            <w:proofErr w:type="spellEnd"/>
-            <w:r>
-              <w:rPr>
-                <w:sz w:val="24"/>
-                <w:szCs w:val="24"/>
-              </w:rPr>
-              <w:t>(</w:t>
-            </w:r>
-            <w:proofErr w:type="gramEnd"/>
-            <w:r>
-              <w:rPr>
-                <w:sz w:val="24"/>
-                <w:szCs w:val="24"/>
-              </w:rPr>
-              <w:t>)</w:t>
+            <w:r>
+              <w:rPr>
+                <w:sz w:val="24"/>
+                <w:szCs w:val="24"/>
+              </w:rPr>
+              <w:t>toLowerCase()</w:t>
             </w:r>
           </w:p>
         </w:tc>
@@ -3396,32 +3097,7 @@
                 <w:sz w:val="24"/>
                 <w:szCs w:val="24"/>
               </w:rPr>
-              <w:t>"JAVA</w:t>
-            </w:r>
-            <w:proofErr w:type="gramStart"/>
-            <w:r>
-              <w:rPr>
-                <w:sz w:val="24"/>
-                <w:szCs w:val="24"/>
-              </w:rPr>
-              <w:t>".</w:t>
-            </w:r>
-            <w:proofErr w:type="spellStart"/>
-            <w:r>
-              <w:rPr>
-                <w:sz w:val="24"/>
-                <w:szCs w:val="24"/>
-              </w:rPr>
-              <w:t>toLowerCase</w:t>
-            </w:r>
-            <w:proofErr w:type="spellEnd"/>
-            <w:proofErr w:type="gramEnd"/>
-            <w:r>
-              <w:rPr>
-                <w:sz w:val="24"/>
-                <w:szCs w:val="24"/>
-              </w:rPr>
-              <w:t>()</w:t>
+              <w:t>"JAVA".toLowerCase()</w:t>
             </w:r>
           </w:p>
         </w:tc>
@@ -3469,21 +3145,12 @@
                 <w:szCs w:val="24"/>
               </w:rPr>
             </w:pPr>
-            <w:proofErr w:type="gramStart"/>
-            <w:r>
-              <w:rPr>
-                <w:sz w:val="24"/>
-                <w:szCs w:val="24"/>
-              </w:rPr>
-              <w:t>equals(</w:t>
-            </w:r>
-            <w:proofErr w:type="gramEnd"/>
-            <w:r>
-              <w:rPr>
-                <w:sz w:val="24"/>
-                <w:szCs w:val="24"/>
-              </w:rPr>
-              <w:t>)</w:t>
+            <w:r>
+              <w:rPr>
+                <w:sz w:val="24"/>
+                <w:szCs w:val="24"/>
+              </w:rPr>
+              <w:t>equals()</w:t>
             </w:r>
           </w:p>
         </w:tc>
@@ -3531,32 +3198,7 @@
                 <w:sz w:val="24"/>
                 <w:szCs w:val="24"/>
               </w:rPr>
-              <w:t>"</w:t>
-            </w:r>
-            <w:proofErr w:type="spellStart"/>
-            <w:r>
-              <w:rPr>
-                <w:sz w:val="24"/>
-                <w:szCs w:val="24"/>
-              </w:rPr>
-              <w:t>Java</w:t>
-            </w:r>
-            <w:proofErr w:type="gramStart"/>
-            <w:r>
-              <w:rPr>
-                <w:sz w:val="24"/>
-                <w:szCs w:val="24"/>
-              </w:rPr>
-              <w:t>".equals</w:t>
-            </w:r>
-            <w:proofErr w:type="spellEnd"/>
-            <w:proofErr w:type="gramEnd"/>
-            <w:r>
-              <w:rPr>
-                <w:sz w:val="24"/>
-                <w:szCs w:val="24"/>
-              </w:rPr>
-              <w:t>("Java")</w:t>
+              <w:t>"Java".equals("Java")</w:t>
             </w:r>
           </w:p>
         </w:tc>
@@ -3601,30 +3243,12 @@
                 <w:szCs w:val="24"/>
               </w:rPr>
             </w:pPr>
-            <w:proofErr w:type="spellStart"/>
-            <w:proofErr w:type="gramStart"/>
-            <w:r>
-              <w:rPr>
-                <w:sz w:val="24"/>
-                <w:szCs w:val="24"/>
-              </w:rPr>
-              <w:t>equalsIgnoreCase</w:t>
-            </w:r>
-            <w:proofErr w:type="spellEnd"/>
-            <w:r>
-              <w:rPr>
-                <w:sz w:val="24"/>
-                <w:szCs w:val="24"/>
-              </w:rPr>
-              <w:t>(</w:t>
-            </w:r>
-            <w:proofErr w:type="gramEnd"/>
-            <w:r>
-              <w:rPr>
-                <w:sz w:val="24"/>
-                <w:szCs w:val="24"/>
-              </w:rPr>
-              <w:t>)</w:t>
+            <w:r>
+              <w:rPr>
+                <w:sz w:val="24"/>
+                <w:szCs w:val="24"/>
+              </w:rPr>
+              <w:t>equalsIgnoreCase()</w:t>
             </w:r>
           </w:p>
         </w:tc>
@@ -3672,32 +3296,7 @@
                 <w:sz w:val="24"/>
                 <w:szCs w:val="24"/>
               </w:rPr>
-              <w:t>"java</w:t>
-            </w:r>
-            <w:proofErr w:type="gramStart"/>
-            <w:r>
-              <w:rPr>
-                <w:sz w:val="24"/>
-                <w:szCs w:val="24"/>
-              </w:rPr>
-              <w:t>".</w:t>
-            </w:r>
-            <w:proofErr w:type="spellStart"/>
-            <w:r>
-              <w:rPr>
-                <w:sz w:val="24"/>
-                <w:szCs w:val="24"/>
-              </w:rPr>
-              <w:t>equalsIgnoreCase</w:t>
-            </w:r>
-            <w:proofErr w:type="spellEnd"/>
-            <w:proofErr w:type="gramEnd"/>
-            <w:r>
-              <w:rPr>
-                <w:sz w:val="24"/>
-                <w:szCs w:val="24"/>
-              </w:rPr>
-              <w:t>("JAVA")</w:t>
+              <w:t>"java".equalsIgnoreCase("JAVA")</w:t>
             </w:r>
           </w:p>
         </w:tc>
@@ -3745,21 +3344,12 @@
                 <w:szCs w:val="24"/>
               </w:rPr>
             </w:pPr>
-            <w:proofErr w:type="gramStart"/>
-            <w:r>
-              <w:rPr>
-                <w:sz w:val="24"/>
-                <w:szCs w:val="24"/>
-              </w:rPr>
-              <w:t>contains(</w:t>
-            </w:r>
-            <w:proofErr w:type="gramEnd"/>
-            <w:r>
-              <w:rPr>
-                <w:sz w:val="24"/>
-                <w:szCs w:val="24"/>
-              </w:rPr>
-              <w:t>)</w:t>
+            <w:r>
+              <w:rPr>
+                <w:sz w:val="24"/>
+                <w:szCs w:val="24"/>
+              </w:rPr>
+              <w:t>contains()</w:t>
             </w:r>
           </w:p>
         </w:tc>
@@ -3816,32 +3406,7 @@
                 <w:szCs w:val="24"/>
               </w:rPr>
               <w:lastRenderedPageBreak/>
-              <w:t>"</w:t>
-            </w:r>
-            <w:proofErr w:type="spellStart"/>
-            <w:r>
-              <w:rPr>
-                <w:sz w:val="24"/>
-                <w:szCs w:val="24"/>
-              </w:rPr>
-              <w:t>Programming</w:t>
-            </w:r>
-            <w:proofErr w:type="gramStart"/>
-            <w:r>
-              <w:rPr>
-                <w:sz w:val="24"/>
-                <w:szCs w:val="24"/>
-              </w:rPr>
-              <w:t>".contains</w:t>
-            </w:r>
-            <w:proofErr w:type="spellEnd"/>
-            <w:proofErr w:type="gramEnd"/>
-            <w:r>
-              <w:rPr>
-                <w:sz w:val="24"/>
-                <w:szCs w:val="24"/>
-              </w:rPr>
-              <w:t>("gram")</w:t>
+              <w:t>"Programming".contains("gram")</w:t>
             </w:r>
           </w:p>
         </w:tc>
@@ -3886,30 +3451,12 @@
                 <w:szCs w:val="24"/>
               </w:rPr>
             </w:pPr>
-            <w:proofErr w:type="spellStart"/>
-            <w:proofErr w:type="gramStart"/>
-            <w:r>
-              <w:rPr>
-                <w:sz w:val="24"/>
-                <w:szCs w:val="24"/>
-              </w:rPr>
-              <w:t>startsWith</w:t>
-            </w:r>
-            <w:proofErr w:type="spellEnd"/>
-            <w:r>
-              <w:rPr>
-                <w:sz w:val="24"/>
-                <w:szCs w:val="24"/>
-              </w:rPr>
-              <w:t>(</w:t>
-            </w:r>
-            <w:proofErr w:type="gramEnd"/>
-            <w:r>
-              <w:rPr>
-                <w:sz w:val="24"/>
-                <w:szCs w:val="24"/>
-              </w:rPr>
-              <w:t>)</w:t>
+            <w:r>
+              <w:rPr>
+                <w:sz w:val="24"/>
+                <w:szCs w:val="24"/>
+              </w:rPr>
+              <w:t>startsWith()</w:t>
             </w:r>
           </w:p>
         </w:tc>
@@ -3957,32 +3504,7 @@
                 <w:sz w:val="24"/>
                 <w:szCs w:val="24"/>
               </w:rPr>
-              <w:t>"Java</w:t>
-            </w:r>
-            <w:proofErr w:type="gramStart"/>
-            <w:r>
-              <w:rPr>
-                <w:sz w:val="24"/>
-                <w:szCs w:val="24"/>
-              </w:rPr>
-              <w:t>".</w:t>
-            </w:r>
-            <w:proofErr w:type="spellStart"/>
-            <w:r>
-              <w:rPr>
-                <w:sz w:val="24"/>
-                <w:szCs w:val="24"/>
-              </w:rPr>
-              <w:t>startsWith</w:t>
-            </w:r>
-            <w:proofErr w:type="spellEnd"/>
-            <w:proofErr w:type="gramEnd"/>
-            <w:r>
-              <w:rPr>
-                <w:sz w:val="24"/>
-                <w:szCs w:val="24"/>
-              </w:rPr>
-              <w:t>("Ja")</w:t>
+              <w:t>"Java".startsWith("Ja")</w:t>
             </w:r>
           </w:p>
         </w:tc>
@@ -4030,30 +3552,12 @@
                 <w:szCs w:val="24"/>
               </w:rPr>
             </w:pPr>
-            <w:proofErr w:type="spellStart"/>
-            <w:proofErr w:type="gramStart"/>
-            <w:r>
-              <w:rPr>
-                <w:sz w:val="24"/>
-                <w:szCs w:val="24"/>
-              </w:rPr>
-              <w:t>endsWith</w:t>
-            </w:r>
-            <w:proofErr w:type="spellEnd"/>
-            <w:r>
-              <w:rPr>
-                <w:sz w:val="24"/>
-                <w:szCs w:val="24"/>
-              </w:rPr>
-              <w:t>(</w:t>
-            </w:r>
-            <w:proofErr w:type="gramEnd"/>
-            <w:r>
-              <w:rPr>
-                <w:sz w:val="24"/>
-                <w:szCs w:val="24"/>
-              </w:rPr>
-              <w:t>)</w:t>
+            <w:r>
+              <w:rPr>
+                <w:sz w:val="24"/>
+                <w:szCs w:val="24"/>
+              </w:rPr>
+              <w:t>endsWith()</w:t>
             </w:r>
           </w:p>
         </w:tc>
@@ -4101,48 +3605,7 @@
                 <w:sz w:val="24"/>
                 <w:szCs w:val="24"/>
               </w:rPr>
-              <w:t>"Java</w:t>
-            </w:r>
-            <w:proofErr w:type="gramStart"/>
-            <w:r>
-              <w:rPr>
-                <w:sz w:val="24"/>
-                <w:szCs w:val="24"/>
-              </w:rPr>
-              <w:t>".</w:t>
-            </w:r>
-            <w:proofErr w:type="spellStart"/>
-            <w:r>
-              <w:rPr>
-                <w:sz w:val="24"/>
-                <w:szCs w:val="24"/>
-              </w:rPr>
-              <w:t>endsWith</w:t>
-            </w:r>
-            <w:proofErr w:type="spellEnd"/>
-            <w:proofErr w:type="gramEnd"/>
-            <w:r>
-              <w:rPr>
-                <w:sz w:val="24"/>
-                <w:szCs w:val="24"/>
-              </w:rPr>
-              <w:t>("</w:t>
-            </w:r>
-            <w:proofErr w:type="spellStart"/>
-            <w:r>
-              <w:rPr>
-                <w:sz w:val="24"/>
-                <w:szCs w:val="24"/>
-              </w:rPr>
-              <w:t>va</w:t>
-            </w:r>
-            <w:proofErr w:type="spellEnd"/>
-            <w:r>
-              <w:rPr>
-                <w:sz w:val="24"/>
-                <w:szCs w:val="24"/>
-              </w:rPr>
-              <w:t>")</w:t>
+              <w:t>"Java".endsWith("va")</w:t>
             </w:r>
           </w:p>
         </w:tc>
@@ -4187,21 +3650,12 @@
                 <w:szCs w:val="24"/>
               </w:rPr>
             </w:pPr>
-            <w:proofErr w:type="gramStart"/>
-            <w:r>
-              <w:rPr>
-                <w:sz w:val="24"/>
-                <w:szCs w:val="24"/>
-              </w:rPr>
-              <w:t>replace(</w:t>
-            </w:r>
-            <w:proofErr w:type="gramEnd"/>
-            <w:r>
-              <w:rPr>
-                <w:sz w:val="24"/>
-                <w:szCs w:val="24"/>
-              </w:rPr>
-              <w:t>)</w:t>
+            <w:r>
+              <w:rPr>
+                <w:sz w:val="24"/>
+                <w:szCs w:val="24"/>
+              </w:rPr>
+              <w:t>replace()</w:t>
             </w:r>
           </w:p>
         </w:tc>
@@ -4249,32 +3703,7 @@
                 <w:sz w:val="24"/>
                 <w:szCs w:val="24"/>
               </w:rPr>
-              <w:t>"</w:t>
-            </w:r>
-            <w:proofErr w:type="spellStart"/>
-            <w:r>
-              <w:rPr>
-                <w:sz w:val="24"/>
-                <w:szCs w:val="24"/>
-              </w:rPr>
-              <w:t>Java</w:t>
-            </w:r>
-            <w:proofErr w:type="gramStart"/>
-            <w:r>
-              <w:rPr>
-                <w:sz w:val="24"/>
-                <w:szCs w:val="24"/>
-              </w:rPr>
-              <w:t>".replace</w:t>
-            </w:r>
-            <w:proofErr w:type="spellEnd"/>
-            <w:proofErr w:type="gramEnd"/>
-            <w:r>
-              <w:rPr>
-                <w:sz w:val="24"/>
-                <w:szCs w:val="24"/>
-              </w:rPr>
-              <w:t>("J","L")</w:t>
+              <w:t>"Java".replace("J","L")</w:t>
             </w:r>
           </w:p>
         </w:tc>
@@ -4322,21 +3751,12 @@
                 <w:szCs w:val="24"/>
               </w:rPr>
             </w:pPr>
-            <w:proofErr w:type="gramStart"/>
-            <w:r>
-              <w:rPr>
-                <w:sz w:val="24"/>
-                <w:szCs w:val="24"/>
-              </w:rPr>
-              <w:t>trim(</w:t>
-            </w:r>
-            <w:proofErr w:type="gramEnd"/>
-            <w:r>
-              <w:rPr>
-                <w:sz w:val="24"/>
-                <w:szCs w:val="24"/>
-              </w:rPr>
-              <w:t>)</w:t>
+            <w:r>
+              <w:rPr>
+                <w:sz w:val="24"/>
+                <w:szCs w:val="24"/>
+              </w:rPr>
+              <w:t>trim()</w:t>
             </w:r>
           </w:p>
         </w:tc>
@@ -4384,23 +3804,7 @@
                 <w:sz w:val="24"/>
                 <w:szCs w:val="24"/>
               </w:rPr>
-              <w:t xml:space="preserve">" Java </w:t>
-            </w:r>
-            <w:proofErr w:type="gramStart"/>
-            <w:r>
-              <w:rPr>
-                <w:sz w:val="24"/>
-                <w:szCs w:val="24"/>
-              </w:rPr>
-              <w:t>".trim</w:t>
-            </w:r>
-            <w:proofErr w:type="gramEnd"/>
-            <w:r>
-              <w:rPr>
-                <w:sz w:val="24"/>
-                <w:szCs w:val="24"/>
-              </w:rPr>
-              <w:t>()</w:t>
+              <w:t>" Java ".trim()</w:t>
             </w:r>
           </w:p>
         </w:tc>
@@ -4445,21 +3849,12 @@
                 <w:szCs w:val="24"/>
               </w:rPr>
             </w:pPr>
-            <w:proofErr w:type="gramStart"/>
-            <w:r>
-              <w:rPr>
-                <w:sz w:val="24"/>
-                <w:szCs w:val="24"/>
-              </w:rPr>
-              <w:t>split(</w:t>
-            </w:r>
-            <w:proofErr w:type="gramEnd"/>
-            <w:r>
-              <w:rPr>
-                <w:sz w:val="24"/>
-                <w:szCs w:val="24"/>
-              </w:rPr>
-              <w:t>)</w:t>
+            <w:r>
+              <w:rPr>
+                <w:sz w:val="24"/>
+                <w:szCs w:val="24"/>
+              </w:rPr>
+              <w:t>split()</w:t>
             </w:r>
           </w:p>
         </w:tc>
@@ -4507,41 +3902,7 @@
                 <w:sz w:val="24"/>
                 <w:szCs w:val="24"/>
               </w:rPr>
-              <w:t>"</w:t>
-            </w:r>
-            <w:proofErr w:type="spellStart"/>
-            <w:proofErr w:type="gramStart"/>
-            <w:r>
-              <w:rPr>
-                <w:sz w:val="24"/>
-                <w:szCs w:val="24"/>
-              </w:rPr>
-              <w:t>A,B</w:t>
-            </w:r>
-            <w:proofErr w:type="gramEnd"/>
-            <w:r>
-              <w:rPr>
-                <w:sz w:val="24"/>
-                <w:szCs w:val="24"/>
-              </w:rPr>
-              <w:t>,C</w:t>
-            </w:r>
-            <w:proofErr w:type="gramStart"/>
-            <w:r>
-              <w:rPr>
-                <w:sz w:val="24"/>
-                <w:szCs w:val="24"/>
-              </w:rPr>
-              <w:t>".split</w:t>
-            </w:r>
-            <w:proofErr w:type="spellEnd"/>
-            <w:proofErr w:type="gramEnd"/>
-            <w:r>
-              <w:rPr>
-                <w:sz w:val="24"/>
-                <w:szCs w:val="24"/>
-              </w:rPr>
-              <w:t>(",")</w:t>
+              <w:t>"A,B,C".split(",")</w:t>
             </w:r>
           </w:p>
         </w:tc>
@@ -4589,30 +3950,12 @@
                 <w:szCs w:val="24"/>
               </w:rPr>
             </w:pPr>
-            <w:proofErr w:type="spellStart"/>
-            <w:proofErr w:type="gramStart"/>
-            <w:r>
-              <w:rPr>
-                <w:sz w:val="24"/>
-                <w:szCs w:val="24"/>
-              </w:rPr>
-              <w:t>indexOf</w:t>
-            </w:r>
-            <w:proofErr w:type="spellEnd"/>
-            <w:r>
-              <w:rPr>
-                <w:sz w:val="24"/>
-                <w:szCs w:val="24"/>
-              </w:rPr>
-              <w:t>(</w:t>
-            </w:r>
-            <w:proofErr w:type="gramEnd"/>
-            <w:r>
-              <w:rPr>
-                <w:sz w:val="24"/>
-                <w:szCs w:val="24"/>
-              </w:rPr>
-              <w:t>)</w:t>
+            <w:r>
+              <w:rPr>
+                <w:sz w:val="24"/>
+                <w:szCs w:val="24"/>
+              </w:rPr>
+              <w:t>indexOf()</w:t>
             </w:r>
           </w:p>
         </w:tc>
@@ -4660,32 +4003,7 @@
                 <w:sz w:val="24"/>
                 <w:szCs w:val="24"/>
               </w:rPr>
-              <w:t>"Java</w:t>
-            </w:r>
-            <w:proofErr w:type="gramStart"/>
-            <w:r>
-              <w:rPr>
-                <w:sz w:val="24"/>
-                <w:szCs w:val="24"/>
-              </w:rPr>
-              <w:t>".</w:t>
-            </w:r>
-            <w:proofErr w:type="spellStart"/>
-            <w:r>
-              <w:rPr>
-                <w:sz w:val="24"/>
-                <w:szCs w:val="24"/>
-              </w:rPr>
-              <w:t>indexOf</w:t>
-            </w:r>
-            <w:proofErr w:type="spellEnd"/>
-            <w:proofErr w:type="gramEnd"/>
-            <w:r>
-              <w:rPr>
-                <w:sz w:val="24"/>
-                <w:szCs w:val="24"/>
-              </w:rPr>
-              <w:t>("v")</w:t>
+              <w:t>"Java".indexOf("v")</w:t>
             </w:r>
           </w:p>
         </w:tc>
@@ -4730,30 +4048,12 @@
                 <w:szCs w:val="24"/>
               </w:rPr>
             </w:pPr>
-            <w:proofErr w:type="spellStart"/>
-            <w:proofErr w:type="gramStart"/>
-            <w:r>
-              <w:rPr>
-                <w:sz w:val="24"/>
-                <w:szCs w:val="24"/>
-              </w:rPr>
-              <w:t>lastIndexOf</w:t>
-            </w:r>
-            <w:proofErr w:type="spellEnd"/>
-            <w:r>
-              <w:rPr>
-                <w:sz w:val="24"/>
-                <w:szCs w:val="24"/>
-              </w:rPr>
-              <w:t>(</w:t>
-            </w:r>
-            <w:proofErr w:type="gramEnd"/>
-            <w:r>
-              <w:rPr>
-                <w:sz w:val="24"/>
-                <w:szCs w:val="24"/>
-              </w:rPr>
-              <w:t>)</w:t>
+            <w:r>
+              <w:rPr>
+                <w:sz w:val="24"/>
+                <w:szCs w:val="24"/>
+              </w:rPr>
+              <w:t>lastIndexOf()</w:t>
             </w:r>
           </w:p>
         </w:tc>
@@ -4801,32 +4101,7 @@
                 <w:sz w:val="24"/>
                 <w:szCs w:val="24"/>
               </w:rPr>
-              <w:t>"Java Java</w:t>
-            </w:r>
-            <w:proofErr w:type="gramStart"/>
-            <w:r>
-              <w:rPr>
-                <w:sz w:val="24"/>
-                <w:szCs w:val="24"/>
-              </w:rPr>
-              <w:t>".</w:t>
-            </w:r>
-            <w:proofErr w:type="spellStart"/>
-            <w:r>
-              <w:rPr>
-                <w:sz w:val="24"/>
-                <w:szCs w:val="24"/>
-              </w:rPr>
-              <w:t>lastIndexOf</w:t>
-            </w:r>
-            <w:proofErr w:type="spellEnd"/>
-            <w:proofErr w:type="gramEnd"/>
-            <w:r>
-              <w:rPr>
-                <w:sz w:val="24"/>
-                <w:szCs w:val="24"/>
-              </w:rPr>
-              <w:t>("a")</w:t>
+              <w:t>"Java Java".lastIndexOf("a")</w:t>
             </w:r>
           </w:p>
         </w:tc>
@@ -4874,30 +4149,12 @@
                 <w:szCs w:val="24"/>
               </w:rPr>
             </w:pPr>
-            <w:proofErr w:type="spellStart"/>
-            <w:proofErr w:type="gramStart"/>
-            <w:r>
-              <w:rPr>
-                <w:sz w:val="24"/>
-                <w:szCs w:val="24"/>
-              </w:rPr>
-              <w:t>concat</w:t>
-            </w:r>
-            <w:proofErr w:type="spellEnd"/>
-            <w:r>
-              <w:rPr>
-                <w:sz w:val="24"/>
-                <w:szCs w:val="24"/>
-              </w:rPr>
-              <w:t>(</w:t>
-            </w:r>
-            <w:proofErr w:type="gramEnd"/>
-            <w:r>
-              <w:rPr>
-                <w:sz w:val="24"/>
-                <w:szCs w:val="24"/>
-              </w:rPr>
-              <w:t>)</w:t>
+            <w:r>
+              <w:rPr>
+                <w:sz w:val="24"/>
+                <w:szCs w:val="24"/>
+              </w:rPr>
+              <w:t>concat()</w:t>
             </w:r>
           </w:p>
         </w:tc>
@@ -4945,32 +4202,7 @@
                 <w:sz w:val="24"/>
                 <w:szCs w:val="24"/>
               </w:rPr>
-              <w:t>"Hello</w:t>
-            </w:r>
-            <w:proofErr w:type="gramStart"/>
-            <w:r>
-              <w:rPr>
-                <w:sz w:val="24"/>
-                <w:szCs w:val="24"/>
-              </w:rPr>
-              <w:t>".</w:t>
-            </w:r>
-            <w:proofErr w:type="spellStart"/>
-            <w:r>
-              <w:rPr>
-                <w:sz w:val="24"/>
-                <w:szCs w:val="24"/>
-              </w:rPr>
-              <w:t>concat</w:t>
-            </w:r>
-            <w:proofErr w:type="spellEnd"/>
-            <w:proofErr w:type="gramEnd"/>
-            <w:r>
-              <w:rPr>
-                <w:sz w:val="24"/>
-                <w:szCs w:val="24"/>
-              </w:rPr>
-              <w:t>(" World")</w:t>
+              <w:t>"Hello".concat(" World")</w:t>
             </w:r>
           </w:p>
         </w:tc>
@@ -5015,30 +4247,12 @@
                 <w:szCs w:val="24"/>
               </w:rPr>
             </w:pPr>
-            <w:proofErr w:type="spellStart"/>
-            <w:proofErr w:type="gramStart"/>
-            <w:r>
-              <w:rPr>
-                <w:sz w:val="24"/>
-                <w:szCs w:val="24"/>
-              </w:rPr>
-              <w:t>isEmpty</w:t>
-            </w:r>
-            <w:proofErr w:type="spellEnd"/>
-            <w:r>
-              <w:rPr>
-                <w:sz w:val="24"/>
-                <w:szCs w:val="24"/>
-              </w:rPr>
-              <w:t>(</w:t>
-            </w:r>
-            <w:proofErr w:type="gramEnd"/>
-            <w:r>
-              <w:rPr>
-                <w:sz w:val="24"/>
-                <w:szCs w:val="24"/>
-              </w:rPr>
-              <w:t>)</w:t>
+            <w:r>
+              <w:rPr>
+                <w:sz w:val="24"/>
+                <w:szCs w:val="24"/>
+              </w:rPr>
+              <w:t>isEmpty()</w:t>
             </w:r>
           </w:p>
         </w:tc>
@@ -5086,32 +4300,7 @@
                 <w:sz w:val="24"/>
                 <w:szCs w:val="24"/>
               </w:rPr>
-              <w:t>"</w:t>
-            </w:r>
-            <w:proofErr w:type="gramStart"/>
-            <w:r>
-              <w:rPr>
-                <w:sz w:val="24"/>
-                <w:szCs w:val="24"/>
-              </w:rPr>
-              <w:t>".</w:t>
-            </w:r>
-            <w:proofErr w:type="spellStart"/>
-            <w:r>
-              <w:rPr>
-                <w:sz w:val="24"/>
-                <w:szCs w:val="24"/>
-              </w:rPr>
-              <w:t>isEmpty</w:t>
-            </w:r>
-            <w:proofErr w:type="spellEnd"/>
-            <w:proofErr w:type="gramEnd"/>
-            <w:r>
-              <w:rPr>
-                <w:sz w:val="24"/>
-                <w:szCs w:val="24"/>
-              </w:rPr>
-              <w:t>()</w:t>
+              <w:t>"".isEmpty()</w:t>
             </w:r>
           </w:p>
         </w:tc>
@@ -5159,21 +4348,12 @@
                 <w:szCs w:val="24"/>
               </w:rPr>
             </w:pPr>
-            <w:proofErr w:type="gramStart"/>
-            <w:r>
-              <w:rPr>
-                <w:sz w:val="24"/>
-                <w:szCs w:val="24"/>
-              </w:rPr>
-              <w:t>join(</w:t>
-            </w:r>
-            <w:proofErr w:type="gramEnd"/>
-            <w:r>
-              <w:rPr>
-                <w:sz w:val="24"/>
-                <w:szCs w:val="24"/>
-              </w:rPr>
-              <w:t>)</w:t>
+            <w:r>
+              <w:rPr>
+                <w:sz w:val="24"/>
+                <w:szCs w:val="24"/>
+              </w:rPr>
+              <w:t>join()</w:t>
             </w:r>
           </w:p>
         </w:tc>
@@ -5216,21 +4396,12 @@
                 <w:szCs w:val="24"/>
               </w:rPr>
             </w:pPr>
-            <w:proofErr w:type="spellStart"/>
-            <w:r>
-              <w:rPr>
-                <w:sz w:val="24"/>
-                <w:szCs w:val="24"/>
-              </w:rPr>
-              <w:t>String.join</w:t>
-            </w:r>
-            <w:proofErr w:type="spellEnd"/>
-            <w:r>
-              <w:rPr>
-                <w:sz w:val="24"/>
-                <w:szCs w:val="24"/>
-              </w:rPr>
-              <w:t>("-", "A","B","C")</w:t>
+            <w:r>
+              <w:rPr>
+                <w:sz w:val="24"/>
+                <w:szCs w:val="24"/>
+              </w:rPr>
+              <w:t>String.join("-", "A","B","C")</w:t>
             </w:r>
           </w:p>
         </w:tc>
@@ -5275,30 +4446,12 @@
                 <w:szCs w:val="24"/>
               </w:rPr>
             </w:pPr>
-            <w:proofErr w:type="spellStart"/>
-            <w:proofErr w:type="gramStart"/>
-            <w:r>
-              <w:rPr>
-                <w:sz w:val="24"/>
-                <w:szCs w:val="24"/>
-              </w:rPr>
-              <w:t>compareTo</w:t>
-            </w:r>
-            <w:proofErr w:type="spellEnd"/>
-            <w:r>
-              <w:rPr>
-                <w:sz w:val="24"/>
-                <w:szCs w:val="24"/>
-              </w:rPr>
-              <w:t>(</w:t>
-            </w:r>
-            <w:proofErr w:type="gramEnd"/>
-            <w:r>
-              <w:rPr>
-                <w:sz w:val="24"/>
-                <w:szCs w:val="24"/>
-              </w:rPr>
-              <w:t>)</w:t>
+            <w:r>
+              <w:rPr>
+                <w:sz w:val="24"/>
+                <w:szCs w:val="24"/>
+              </w:rPr>
+              <w:t>compareTo()</w:t>
             </w:r>
           </w:p>
         </w:tc>
@@ -5346,32 +4499,7 @@
                 <w:sz w:val="24"/>
                 <w:szCs w:val="24"/>
               </w:rPr>
-              <w:t>"A</w:t>
-            </w:r>
-            <w:proofErr w:type="gramStart"/>
-            <w:r>
-              <w:rPr>
-                <w:sz w:val="24"/>
-                <w:szCs w:val="24"/>
-              </w:rPr>
-              <w:t>".</w:t>
-            </w:r>
-            <w:proofErr w:type="spellStart"/>
-            <w:r>
-              <w:rPr>
-                <w:sz w:val="24"/>
-                <w:szCs w:val="24"/>
-              </w:rPr>
-              <w:t>compareTo</w:t>
-            </w:r>
-            <w:proofErr w:type="spellEnd"/>
-            <w:proofErr w:type="gramEnd"/>
-            <w:r>
-              <w:rPr>
-                <w:sz w:val="24"/>
-                <w:szCs w:val="24"/>
-              </w:rPr>
-              <w:t>("B")</w:t>
+              <w:t>"A".compareTo("B")</w:t>
             </w:r>
           </w:p>
         </w:tc>
@@ -5553,32 +4681,7 @@
           <w:sz w:val="24"/>
           <w:szCs w:val="24"/>
         </w:rPr>
-        <w:t xml:space="preserve">. The array object stores metadata such as its type and length, along with its elements. When accessing an element like </w:t>
-      </w:r>
-      <w:proofErr w:type="spellStart"/>
-      <w:proofErr w:type="gramStart"/>
-      <w:r>
-        <w:rPr>
-          <w:sz w:val="24"/>
-          <w:szCs w:val="24"/>
-        </w:rPr>
-        <w:t>arr</w:t>
-      </w:r>
-      <w:proofErr w:type="spellEnd"/>
-      <w:r>
-        <w:rPr>
-          <w:sz w:val="24"/>
-          <w:szCs w:val="24"/>
-        </w:rPr>
-        <w:t>[</w:t>
-      </w:r>
-      <w:proofErr w:type="gramEnd"/>
-      <w:r>
-        <w:rPr>
-          <w:sz w:val="24"/>
-          <w:szCs w:val="24"/>
-        </w:rPr>
-        <w:t xml:space="preserve">3], the JVM calculates its memory location and retrieves the value while performing </w:t>
+        <w:t xml:space="preserve">. The array object stores metadata such as its type and length, along with its elements. When accessing an element like arr[3], the JVM calculates its memory location and retrieves the value while performing </w:t>
       </w:r>
       <w:r>
         <w:rPr>
@@ -5667,71 +4770,7 @@
           <w:sz w:val="24"/>
           <w:szCs w:val="24"/>
         </w:rPr>
-        <w:t xml:space="preserve"> and initializes all elements with null references. For example, </w:t>
-      </w:r>
-      <w:proofErr w:type="gramStart"/>
-      <w:r>
-        <w:rPr>
-          <w:sz w:val="24"/>
-          <w:szCs w:val="24"/>
-        </w:rPr>
-        <w:t>Student[</w:t>
-      </w:r>
-      <w:proofErr w:type="gramEnd"/>
-      <w:r>
-        <w:rPr>
-          <w:sz w:val="24"/>
-          <w:szCs w:val="24"/>
-        </w:rPr>
-        <w:t xml:space="preserve">] students = new </w:t>
-      </w:r>
-      <w:proofErr w:type="gramStart"/>
-      <w:r>
-        <w:rPr>
-          <w:sz w:val="24"/>
-          <w:szCs w:val="24"/>
-        </w:rPr>
-        <w:t>Student[</w:t>
-      </w:r>
-      <w:proofErr w:type="gramEnd"/>
-      <w:r>
-        <w:rPr>
-          <w:sz w:val="24"/>
-          <w:szCs w:val="24"/>
-        </w:rPr>
-        <w:t xml:space="preserve">3]; creates an array that can hold three Student object references. When </w:t>
-      </w:r>
-      <w:proofErr w:type="gramStart"/>
-      <w:r>
-        <w:rPr>
-          <w:sz w:val="24"/>
-          <w:szCs w:val="24"/>
-        </w:rPr>
-        <w:t>students[</w:t>
-      </w:r>
-      <w:proofErr w:type="gramEnd"/>
-      <w:r>
-        <w:rPr>
-          <w:sz w:val="24"/>
-          <w:szCs w:val="24"/>
-        </w:rPr>
-        <w:t xml:space="preserve">0] = new </w:t>
-      </w:r>
-      <w:proofErr w:type="gramStart"/>
-      <w:r>
-        <w:rPr>
-          <w:sz w:val="24"/>
-          <w:szCs w:val="24"/>
-        </w:rPr>
-        <w:t>Student(</w:t>
-      </w:r>
-      <w:proofErr w:type="gramEnd"/>
-      <w:r>
-        <w:rPr>
-          <w:sz w:val="24"/>
-          <w:szCs w:val="24"/>
-        </w:rPr>
-        <w:t>); is executed, the first array element stores a reference pointing to the newly created Student object in the heap. The array stores the addresses of objects, while the actual objects are stored separately in memory.</w:t>
+        <w:t xml:space="preserve"> and initializes all elements with null references. For example, Student[] students = new Student[3]; creates an array that can hold three Student object references. When students[0] = new Student(); is executed, the first array element stores a reference pointing to the newly created Student object in the heap. The array stores the addresses of objects, while the actual objects are stored separately in memory.</w:t>
       </w:r>
     </w:p>
     <w:p>
@@ -5914,71 +4953,7 @@
           <w:sz w:val="24"/>
           <w:szCs w:val="24"/>
         </w:rPr>
-        <w:t xml:space="preserve">. A class acts as a blueprint that describes what data (fields) and </w:t>
-      </w:r>
-      <w:proofErr w:type="spellStart"/>
-      <w:r>
-        <w:rPr>
-          <w:sz w:val="24"/>
-          <w:szCs w:val="24"/>
-        </w:rPr>
-        <w:t>behaviors</w:t>
-      </w:r>
-      <w:proofErr w:type="spellEnd"/>
-      <w:r>
-        <w:rPr>
-          <w:sz w:val="24"/>
-          <w:szCs w:val="24"/>
-        </w:rPr>
-        <w:t xml:space="preserve"> (methods) objects of that type will have. Once a class is created, its name can be used as a data type to declare reference variables, just like we use built-in types such as int or String. For example, after creating a </w:t>
-      </w:r>
-      <w:proofErr w:type="gramStart"/>
-      <w:r>
-        <w:rPr>
-          <w:sz w:val="24"/>
-          <w:szCs w:val="24"/>
-        </w:rPr>
-        <w:t>Student</w:t>
-      </w:r>
-      <w:proofErr w:type="gramEnd"/>
-      <w:r>
-        <w:rPr>
-          <w:sz w:val="24"/>
-          <w:szCs w:val="24"/>
-        </w:rPr>
-        <w:t xml:space="preserve"> class, we can write Student s</w:t>
-      </w:r>
-      <w:proofErr w:type="gramStart"/>
-      <w:r>
-        <w:rPr>
-          <w:sz w:val="24"/>
-          <w:szCs w:val="24"/>
-        </w:rPr>
-        <w:t>1;,</w:t>
-      </w:r>
-      <w:proofErr w:type="gramEnd"/>
-      <w:r>
-        <w:rPr>
-          <w:sz w:val="24"/>
-          <w:szCs w:val="24"/>
-        </w:rPr>
-        <w:t xml:space="preserve"> where Student becomes a new data type and s1 becomes a reference variable that can point to a </w:t>
-      </w:r>
-      <w:proofErr w:type="gramStart"/>
-      <w:r>
-        <w:rPr>
-          <w:sz w:val="24"/>
-          <w:szCs w:val="24"/>
-        </w:rPr>
-        <w:t>Student</w:t>
-      </w:r>
-      <w:proofErr w:type="gramEnd"/>
-      <w:r>
-        <w:rPr>
-          <w:sz w:val="24"/>
-          <w:szCs w:val="24"/>
-        </w:rPr>
-        <w:t xml:space="preserve"> object created in memory.</w:t>
+        <w:t>. A class acts as a blueprint that describes what data (fields) and behaviors (methods) objects of that type will have. Once a class is created, its name can be used as a data type to declare reference variables, just like we use built-in types such as int or String. For example, after creating a Student class, we can write Student s1;, where Student becomes a new data type and s1 becomes a reference variable that can point to a Student object created in memory.</w:t>
       </w:r>
     </w:p>
     <w:p>
@@ -6226,98 +5201,46 @@
         </w:rPr>
         <w:t xml:space="preserve">An </w:t>
       </w:r>
-      <w:proofErr w:type="spellStart"/>
-      <w:r>
-        <w:rPr>
-          <w:b/>
-          <w:bCs/>
-          <w:sz w:val="24"/>
-          <w:szCs w:val="24"/>
-        </w:rPr>
-        <w:t>enum</w:t>
-      </w:r>
-      <w:proofErr w:type="spellEnd"/>
-      <w:r>
-        <w:rPr>
-          <w:b/>
-          <w:bCs/>
-          <w:sz w:val="24"/>
-          <w:szCs w:val="24"/>
-        </w:rPr>
-        <w:t xml:space="preserve"> (enumeration)</w:t>
-      </w:r>
-      <w:r>
-        <w:rPr>
-          <w:sz w:val="24"/>
-          <w:szCs w:val="24"/>
-        </w:rPr>
-        <w:t xml:space="preserve"> is a special reference data type in Java used to represent a fixed set of constant values. Instead of creating multiple constant variables, an </w:t>
-      </w:r>
-      <w:proofErr w:type="spellStart"/>
-      <w:proofErr w:type="gramStart"/>
-      <w:r>
-        <w:rPr>
-          <w:sz w:val="24"/>
-          <w:szCs w:val="24"/>
-        </w:rPr>
-        <w:t>enum</w:t>
-      </w:r>
-      <w:proofErr w:type="spellEnd"/>
-      <w:r>
-        <w:rPr>
-          <w:sz w:val="24"/>
-          <w:szCs w:val="24"/>
-        </w:rPr>
-        <w:t xml:space="preserve"> groups</w:t>
-      </w:r>
-      <w:proofErr w:type="gramEnd"/>
-      <w:r>
-        <w:rPr>
-          <w:sz w:val="24"/>
-          <w:szCs w:val="24"/>
-        </w:rPr>
-        <w:t xml:space="preserve"> related constants under a single type, making the code more readable and type-safe.</w:t>
-      </w:r>
-    </w:p>
-    <w:p>
-      <w:pPr>
-        <w:pStyle w:val="ListParagraph"/>
-        <w:rPr>
-          <w:sz w:val="24"/>
-          <w:szCs w:val="24"/>
-        </w:rPr>
-      </w:pPr>
-    </w:p>
-    <w:p>
-      <w:pPr>
-        <w:pStyle w:val="ListParagraph"/>
-        <w:rPr>
-          <w:sz w:val="24"/>
-          <w:szCs w:val="24"/>
-        </w:rPr>
-      </w:pPr>
-      <w:r>
-        <w:rPr>
-          <w:sz w:val="24"/>
-          <w:szCs w:val="24"/>
-        </w:rPr>
-        <w:t xml:space="preserve">When the JVM loads an </w:t>
-      </w:r>
-      <w:proofErr w:type="spellStart"/>
-      <w:r>
-        <w:rPr>
-          <w:sz w:val="24"/>
-          <w:szCs w:val="24"/>
-        </w:rPr>
-        <w:t>enum</w:t>
-      </w:r>
-      <w:proofErr w:type="spellEnd"/>
-      <w:r>
-        <w:rPr>
-          <w:sz w:val="24"/>
-          <w:szCs w:val="24"/>
-        </w:rPr>
-        <w:t xml:space="preserve">, it automatically creates a </w:t>
+      <w:r>
+        <w:rPr>
+          <w:b/>
+          <w:bCs/>
+          <w:sz w:val="24"/>
+          <w:szCs w:val="24"/>
+        </w:rPr>
+        <w:t>enum (enumeration)</w:t>
+      </w:r>
+      <w:r>
+        <w:rPr>
+          <w:sz w:val="24"/>
+          <w:szCs w:val="24"/>
+        </w:rPr>
+        <w:t xml:space="preserve"> is a special reference data type in Java used to represent a fixed set of constant values. Instead of creating multiple constant variables, an enum groups related constants under a single type, making the code more readable and type-safe.</w:t>
+      </w:r>
+    </w:p>
+    <w:p>
+      <w:pPr>
+        <w:pStyle w:val="ListParagraph"/>
+        <w:rPr>
+          <w:sz w:val="24"/>
+          <w:szCs w:val="24"/>
+        </w:rPr>
+      </w:pPr>
+    </w:p>
+    <w:p>
+      <w:pPr>
+        <w:pStyle w:val="ListParagraph"/>
+        <w:rPr>
+          <w:sz w:val="24"/>
+          <w:szCs w:val="24"/>
+        </w:rPr>
+      </w:pPr>
+      <w:r>
+        <w:rPr>
+          <w:sz w:val="24"/>
+          <w:szCs w:val="24"/>
+        </w:rPr>
+        <w:t xml:space="preserve">When the JVM loads an enum, it automatically creates a </w:t>
       </w:r>
       <w:r>
         <w:rPr>
@@ -6333,23 +5256,7 @@
           <w:sz w:val="24"/>
           <w:szCs w:val="24"/>
         </w:rPr>
-        <w:t xml:space="preserve"> for each </w:t>
-      </w:r>
-      <w:proofErr w:type="spellStart"/>
-      <w:r>
-        <w:rPr>
-          <w:sz w:val="24"/>
-          <w:szCs w:val="24"/>
-        </w:rPr>
-        <w:t>enum</w:t>
-      </w:r>
-      <w:proofErr w:type="spellEnd"/>
-      <w:r>
-        <w:rPr>
-          <w:sz w:val="24"/>
-          <w:szCs w:val="24"/>
-        </w:rPr>
-        <w:t xml:space="preserve"> constant. These objects are stored in memory and reused throughout the program.</w:t>
+        <w:t xml:space="preserve"> for each enum constant. These objects are stored in memory and reused throughout the program.</w:t>
       </w:r>
     </w:p>
     <w:p>
@@ -6515,41 +5422,7 @@
         <w:t>record</w:t>
       </w:r>
       <w:r>
-        <w:t xml:space="preserve"> is a special reference data type introduced in Java to represent immutable data. It automatically generates common methods such as the constructor, getters (accessor methods), </w:t>
-      </w:r>
-      <w:proofErr w:type="gramStart"/>
-      <w:r>
-        <w:t>equals(</w:t>
-      </w:r>
-      <w:proofErr w:type="gramEnd"/>
-      <w:r>
-        <w:t xml:space="preserve">), </w:t>
-      </w:r>
-      <w:proofErr w:type="spellStart"/>
-      <w:proofErr w:type="gramStart"/>
-      <w:r>
-        <w:t>hashCode</w:t>
-      </w:r>
-      <w:proofErr w:type="spellEnd"/>
-      <w:r>
-        <w:t>(</w:t>
-      </w:r>
-      <w:proofErr w:type="gramEnd"/>
-      <w:r>
-        <w:t xml:space="preserve">), and </w:t>
-      </w:r>
-      <w:proofErr w:type="spellStart"/>
-      <w:proofErr w:type="gramStart"/>
-      <w:r>
-        <w:t>toString</w:t>
-      </w:r>
-      <w:proofErr w:type="spellEnd"/>
-      <w:r>
-        <w:t>(</w:t>
-      </w:r>
-      <w:proofErr w:type="gramEnd"/>
-      <w:r>
-        <w:t>), reducing the amount of boilerplate code needed for simple data-holding classes.</w:t>
+        <w:t xml:space="preserve"> is a special reference data type introduced in Java to represent immutable data. It automatically generates common methods such as the constructor, getters (accessor methods), equals(), hashCode(), and toString(), reducing the amount of boilerplate code needed for simple data-holding classes.</w:t>
       </w:r>
     </w:p>
     <w:p/>
@@ -6709,15 +5582,7 @@
         <w:ind w:left="993"/>
       </w:pPr>
       <w:r>
-        <w:t xml:space="preserve">Modifiers are keywords that define the visibility, </w:t>
-      </w:r>
-      <w:proofErr w:type="spellStart"/>
-      <w:r>
-        <w:t>behavior</w:t>
-      </w:r>
-      <w:proofErr w:type="spellEnd"/>
-      <w:r>
-        <w:t>, and characteristics of classes, methods, variables, and constructors. They help control access and specify how Java elements can be used.</w:t>
+        <w:t>Modifiers are keywords that define the visibility, behavior, and characteristics of classes, methods, variables, and constructors. They help control access and specify how Java elements can be used.</w:t>
       </w:r>
     </w:p>
     <w:p>
@@ -7481,13 +6346,8 @@
         <w:t>Non-Access Modifiers:</w:t>
       </w:r>
       <w:r>
-        <w:t xml:space="preserve"> static, final, abstract, synchronized, volatile, transient, native, and </w:t>
-      </w:r>
-      <w:proofErr w:type="spellStart"/>
-      <w:r>
-        <w:t>strictfp</w:t>
-      </w:r>
-      <w:proofErr w:type="spellEnd"/>
+        <w:t xml:space="preserve"> static, final, abstract, synchronized, volatile, transient, native, and strictfp</w:t>
+      </w:r>
     </w:p>
     <w:tbl>
       <w:tblPr>
@@ -7928,11 +6788,9 @@
               <w:pStyle w:val="ListParagraph"/>
               <w:spacing w:after="160" w:line="259" w:lineRule="auto"/>
             </w:pPr>
-            <w:proofErr w:type="spellStart"/>
             <w:r>
               <w:t>strictfp</w:t>
             </w:r>
-            <w:proofErr w:type="spellEnd"/>
           </w:p>
         </w:tc>
         <w:tc>
@@ -8123,6 +6981,105 @@
       </w:r>
     </w:p>
     <w:p>
+      <w:r>
+        <w:rPr>
+          <w:noProof/>
+        </w:rPr>
+        <w:drawing>
+          <wp:inline distT="0" distB="0" distL="0" distR="0" wp14:anchorId="74308779" wp14:editId="66C22A18">
+            <wp:extent cx="6210935" cy="2143125"/>
+            <wp:effectExtent l="0" t="0" r="0" b="9525"/>
+            <wp:docPr id="226490402" name="Picture 1"/>
+            <wp:cNvGraphicFramePr>
+              <a:graphicFrameLocks xmlns:a="http://schemas.openxmlformats.org/drawingml/2006/main" noChangeAspect="1"/>
+            </wp:cNvGraphicFramePr>
+            <a:graphic xmlns:a="http://schemas.openxmlformats.org/drawingml/2006/main">
+              <a:graphicData uri="http://schemas.openxmlformats.org/drawingml/2006/picture">
+                <pic:pic xmlns:pic="http://schemas.openxmlformats.org/drawingml/2006/picture">
+                  <pic:nvPicPr>
+                    <pic:cNvPr id="226490402" name=""/>
+                    <pic:cNvPicPr/>
+                  </pic:nvPicPr>
+                  <pic:blipFill>
+                    <a:blip r:embed="rId14"/>
+                    <a:stretch>
+                      <a:fillRect/>
+                    </a:stretch>
+                  </pic:blipFill>
+                  <pic:spPr>
+                    <a:xfrm>
+                      <a:off x="0" y="0"/>
+                      <a:ext cx="6210935" cy="2143125"/>
+                    </a:xfrm>
+                    <a:prstGeom prst="rect">
+                      <a:avLst/>
+                    </a:prstGeom>
+                  </pic:spPr>
+                </pic:pic>
+              </a:graphicData>
+            </a:graphic>
+          </wp:inline>
+        </w:drawing>
+      </w:r>
+    </w:p>
+    <w:p>
+      <w:pPr>
+        <w:rPr>
+          <w:b/>
+          <w:bCs/>
+        </w:rPr>
+      </w:pPr>
+      <w:r>
+        <w:rPr>
+          <w:noProof/>
+        </w:rPr>
+        <w:lastRenderedPageBreak/>
+        <w:drawing>
+          <wp:inline distT="0" distB="0" distL="0" distR="0" wp14:anchorId="190F1B7D" wp14:editId="739E466D">
+            <wp:extent cx="5791200" cy="1743075"/>
+            <wp:effectExtent l="0" t="0" r="0" b="9525"/>
+            <wp:docPr id="121946347" name="Picture 1"/>
+            <wp:cNvGraphicFramePr>
+              <a:graphicFrameLocks xmlns:a="http://schemas.openxmlformats.org/drawingml/2006/main" noChangeAspect="1"/>
+            </wp:cNvGraphicFramePr>
+            <a:graphic xmlns:a="http://schemas.openxmlformats.org/drawingml/2006/main">
+              <a:graphicData uri="http://schemas.openxmlformats.org/drawingml/2006/picture">
+                <pic:pic xmlns:pic="http://schemas.openxmlformats.org/drawingml/2006/picture">
+                  <pic:nvPicPr>
+                    <pic:cNvPr id="121946347" name=""/>
+                    <pic:cNvPicPr/>
+                  </pic:nvPicPr>
+                  <pic:blipFill>
+                    <a:blip r:embed="rId15"/>
+                    <a:stretch>
+                      <a:fillRect/>
+                    </a:stretch>
+                  </pic:blipFill>
+                  <pic:spPr>
+                    <a:xfrm>
+                      <a:off x="0" y="0"/>
+                      <a:ext cx="5791200" cy="1743075"/>
+                    </a:xfrm>
+                    <a:prstGeom prst="rect">
+                      <a:avLst/>
+                    </a:prstGeom>
+                  </pic:spPr>
+                </pic:pic>
+              </a:graphicData>
+            </a:graphic>
+          </wp:inline>
+        </w:drawing>
+      </w:r>
+    </w:p>
+    <w:p>
+      <w:pPr>
+        <w:rPr>
+          <w:b/>
+          <w:bCs/>
+        </w:rPr>
+      </w:pPr>
+    </w:p>
+    <w:p>
       <w:pPr>
         <w:rPr>
           <w:b/>
@@ -8139,17 +7096,168 @@
     </w:p>
     <w:p>
       <w:r>
-        <w:t xml:space="preserve">Output is the information a program displays or writes after processing data. Java uses the </w:t>
-      </w:r>
-      <w:proofErr w:type="spellStart"/>
-      <w:r>
-        <w:t>System.out</w:t>
-      </w:r>
-      <w:proofErr w:type="spellEnd"/>
-      <w:r>
-        <w:t xml:space="preserve"> object to display output on the console.</w:t>
-      </w:r>
-    </w:p>
+        <w:t>Output is the information a program displays or writes after processing data. Java uses the System.out object to display output on the console.</w:t>
+      </w:r>
+    </w:p>
+    <w:tbl>
+      <w:tblPr>
+        <w:tblStyle w:val="PlainTable1"/>
+        <w:tblW w:w="0" w:type="auto"/>
+        <w:tblLook w:val="04A0" w:firstRow="1" w:lastRow="0" w:firstColumn="1" w:lastColumn="0" w:noHBand="0" w:noVBand="1"/>
+      </w:tblPr>
+      <w:tblGrid>
+        <w:gridCol w:w="2051"/>
+        <w:gridCol w:w="4564"/>
+      </w:tblGrid>
+      <w:tr>
+        <w:trPr>
+          <w:cnfStyle w:val="100000000000" w:firstRow="1" w:lastRow="0" w:firstColumn="0" w:lastColumn="0" w:oddVBand="0" w:evenVBand="0" w:oddHBand="0" w:evenHBand="0" w:firstRowFirstColumn="0" w:firstRowLastColumn="0" w:lastRowFirstColumn="0" w:lastRowLastColumn="0"/>
+        </w:trPr>
+        <w:tc>
+          <w:tcPr>
+            <w:cnfStyle w:val="001000000000" w:firstRow="0" w:lastRow="0" w:firstColumn="1" w:lastColumn="0" w:oddVBand="0" w:evenVBand="0" w:oddHBand="0" w:evenHBand="0" w:firstRowFirstColumn="0" w:firstRowLastColumn="0" w:lastRowFirstColumn="0" w:lastRowLastColumn="0"/>
+            <w:tcW w:w="0" w:type="auto"/>
+            <w:hideMark/>
+          </w:tcPr>
+          <w:p>
+            <w:pPr>
+              <w:spacing w:after="160" w:line="259" w:lineRule="auto"/>
+            </w:pPr>
+            <w:r>
+              <w:t>Method</w:t>
+            </w:r>
+          </w:p>
+        </w:tc>
+        <w:tc>
+          <w:tcPr>
+            <w:tcW w:w="0" w:type="auto"/>
+            <w:hideMark/>
+          </w:tcPr>
+          <w:p>
+            <w:pPr>
+              <w:spacing w:after="160" w:line="259" w:lineRule="auto"/>
+              <w:cnfStyle w:val="100000000000" w:firstRow="1" w:lastRow="0" w:firstColumn="0" w:lastColumn="0" w:oddVBand="0" w:evenVBand="0" w:oddHBand="0" w:evenHBand="0" w:firstRowFirstColumn="0" w:firstRowLastColumn="0" w:lastRowFirstColumn="0" w:lastRowLastColumn="0"/>
+            </w:pPr>
+            <w:r>
+              <w:t>Description</w:t>
+            </w:r>
+          </w:p>
+        </w:tc>
+      </w:tr>
+      <w:tr>
+        <w:trPr>
+          <w:cnfStyle w:val="000000100000" w:firstRow="0" w:lastRow="0" w:firstColumn="0" w:lastColumn="0" w:oddVBand="0" w:evenVBand="0" w:oddHBand="1" w:evenHBand="0" w:firstRowFirstColumn="0" w:firstRowLastColumn="0" w:lastRowFirstColumn="0" w:lastRowLastColumn="0"/>
+        </w:trPr>
+        <w:tc>
+          <w:tcPr>
+            <w:cnfStyle w:val="001000000000" w:firstRow="0" w:lastRow="0" w:firstColumn="1" w:lastColumn="0" w:oddVBand="0" w:evenVBand="0" w:oddHBand="0" w:evenHBand="0" w:firstRowFirstColumn="0" w:firstRowLastColumn="0" w:lastRowFirstColumn="0" w:lastRowLastColumn="0"/>
+            <w:tcW w:w="0" w:type="auto"/>
+            <w:hideMark/>
+          </w:tcPr>
+          <w:p>
+            <w:pPr>
+              <w:spacing w:after="160" w:line="259" w:lineRule="auto"/>
+            </w:pPr>
+            <w:r>
+              <w:t>System.out.print()</w:t>
+            </w:r>
+          </w:p>
+        </w:tc>
+        <w:tc>
+          <w:tcPr>
+            <w:tcW w:w="0" w:type="auto"/>
+            <w:hideMark/>
+          </w:tcPr>
+          <w:p>
+            <w:pPr>
+              <w:spacing w:after="160" w:line="259" w:lineRule="auto"/>
+              <w:cnfStyle w:val="000000100000" w:firstRow="0" w:lastRow="0" w:firstColumn="0" w:lastColumn="0" w:oddVBand="0" w:evenVBand="0" w:oddHBand="1" w:evenHBand="0" w:firstRowFirstColumn="0" w:firstRowLastColumn="0" w:lastRowFirstColumn="0" w:lastRowLastColumn="0"/>
+            </w:pPr>
+            <w:r>
+              <w:t>Prints text without moving to a new line.</w:t>
+            </w:r>
+          </w:p>
+        </w:tc>
+      </w:tr>
+      <w:tr>
+        <w:tc>
+          <w:tcPr>
+            <w:cnfStyle w:val="001000000000" w:firstRow="0" w:lastRow="0" w:firstColumn="1" w:lastColumn="0" w:oddVBand="0" w:evenVBand="0" w:oddHBand="0" w:evenHBand="0" w:firstRowFirstColumn="0" w:firstRowLastColumn="0" w:lastRowFirstColumn="0" w:lastRowLastColumn="0"/>
+            <w:tcW w:w="0" w:type="auto"/>
+            <w:hideMark/>
+          </w:tcPr>
+          <w:p>
+            <w:pPr>
+              <w:spacing w:after="160" w:line="259" w:lineRule="auto"/>
+            </w:pPr>
+            <w:r>
+              <w:t>System.out.println()</w:t>
+            </w:r>
+          </w:p>
+        </w:tc>
+        <w:tc>
+          <w:tcPr>
+            <w:tcW w:w="0" w:type="auto"/>
+            <w:hideMark/>
+          </w:tcPr>
+          <w:p>
+            <w:pPr>
+              <w:spacing w:after="160" w:line="259" w:lineRule="auto"/>
+              <w:cnfStyle w:val="000000000000" w:firstRow="0" w:lastRow="0" w:firstColumn="0" w:lastColumn="0" w:oddVBand="0" w:evenVBand="0" w:oddHBand="0" w:evenHBand="0" w:firstRowFirstColumn="0" w:firstRowLastColumn="0" w:lastRowFirstColumn="0" w:lastRowLastColumn="0"/>
+            </w:pPr>
+            <w:r>
+              <w:t>Prints text and moves the cursor to the next line.</w:t>
+            </w:r>
+          </w:p>
+        </w:tc>
+      </w:tr>
+      <w:tr>
+        <w:trPr>
+          <w:cnfStyle w:val="000000100000" w:firstRow="0" w:lastRow="0" w:firstColumn="0" w:lastColumn="0" w:oddVBand="0" w:evenVBand="0" w:oddHBand="1" w:evenHBand="0" w:firstRowFirstColumn="0" w:firstRowLastColumn="0" w:lastRowFirstColumn="0" w:lastRowLastColumn="0"/>
+        </w:trPr>
+        <w:tc>
+          <w:tcPr>
+            <w:cnfStyle w:val="001000000000" w:firstRow="0" w:lastRow="0" w:firstColumn="1" w:lastColumn="0" w:oddVBand="0" w:evenVBand="0" w:oddHBand="0" w:evenHBand="0" w:firstRowFirstColumn="0" w:firstRowLastColumn="0" w:lastRowFirstColumn="0" w:lastRowLastColumn="0"/>
+            <w:tcW w:w="0" w:type="auto"/>
+            <w:hideMark/>
+          </w:tcPr>
+          <w:p>
+            <w:pPr>
+              <w:spacing w:after="160" w:line="259" w:lineRule="auto"/>
+            </w:pPr>
+            <w:r>
+              <w:t>System.out.printf()</w:t>
+            </w:r>
+          </w:p>
+        </w:tc>
+        <w:tc>
+          <w:tcPr>
+            <w:tcW w:w="0" w:type="auto"/>
+            <w:hideMark/>
+          </w:tcPr>
+          <w:p>
+            <w:pPr>
+              <w:spacing w:after="160" w:line="259" w:lineRule="auto"/>
+              <w:cnfStyle w:val="000000100000" w:firstRow="0" w:lastRow="0" w:firstColumn="0" w:lastColumn="0" w:oddVBand="0" w:evenVBand="0" w:oddHBand="1" w:evenHBand="0" w:firstRowFirstColumn="0" w:firstRowLastColumn="0" w:lastRowFirstColumn="0" w:lastRowLastColumn="0"/>
+            </w:pPr>
+            <w:r>
+              <w:t>Prints formatted output using format specifiers.</w:t>
+            </w:r>
+          </w:p>
+        </w:tc>
+      </w:tr>
+    </w:tbl>
+    <w:p/>
+    <w:p>
+      <w:pPr>
+        <w:rPr>
+          <w:b/>
+          <w:bCs/>
+          <w:u w:val="single"/>
+        </w:rPr>
+      </w:pPr>
+    </w:p>
+    <w:p/>
     <w:p/>
     <w:sectPr>
       <w:pgSz w:w="11906" w:h="16838"/>
@@ -8588,6 +7696,95 @@
     </w:lvl>
   </w:abstractNum>
   <w:abstractNum w:abstractNumId="4" w15:restartNumberingAfterBreak="0">
+    <w:nsid w:val="39CD262B"/>
+    <w:multiLevelType w:val="hybridMultilevel"/>
+    <w:tmpl w:val="56489F34"/>
+    <w:lvl w:ilvl="0" w:tplc="FFFFFFFF">
+      <w:start w:val="1"/>
+      <w:numFmt w:val="decimal"/>
+      <w:lvlText w:val="%1."/>
+      <w:lvlJc w:val="left"/>
+      <w:pPr>
+        <w:ind w:left="405" w:hanging="360"/>
+      </w:pPr>
+      <w:rPr>
+        <w:rFonts w:hint="default"/>
+      </w:rPr>
+    </w:lvl>
+    <w:lvl w:ilvl="1" w:tplc="FFFFFFFF" w:tentative="1">
+      <w:start w:val="1"/>
+      <w:numFmt w:val="lowerLetter"/>
+      <w:lvlText w:val="%2."/>
+      <w:lvlJc w:val="left"/>
+      <w:pPr>
+        <w:ind w:left="1125" w:hanging="360"/>
+      </w:pPr>
+    </w:lvl>
+    <w:lvl w:ilvl="2" w:tplc="FFFFFFFF" w:tentative="1">
+      <w:start w:val="1"/>
+      <w:numFmt w:val="lowerRoman"/>
+      <w:lvlText w:val="%3."/>
+      <w:lvlJc w:val="right"/>
+      <w:pPr>
+        <w:ind w:left="1845" w:hanging="180"/>
+      </w:pPr>
+    </w:lvl>
+    <w:lvl w:ilvl="3" w:tplc="FFFFFFFF" w:tentative="1">
+      <w:start w:val="1"/>
+      <w:numFmt w:val="decimal"/>
+      <w:lvlText w:val="%4."/>
+      <w:lvlJc w:val="left"/>
+      <w:pPr>
+        <w:ind w:left="2565" w:hanging="360"/>
+      </w:pPr>
+    </w:lvl>
+    <w:lvl w:ilvl="4" w:tplc="FFFFFFFF" w:tentative="1">
+      <w:start w:val="1"/>
+      <w:numFmt w:val="lowerLetter"/>
+      <w:lvlText w:val="%5."/>
+      <w:lvlJc w:val="left"/>
+      <w:pPr>
+        <w:ind w:left="3285" w:hanging="360"/>
+      </w:pPr>
+    </w:lvl>
+    <w:lvl w:ilvl="5" w:tplc="FFFFFFFF" w:tentative="1">
+      <w:start w:val="1"/>
+      <w:numFmt w:val="lowerRoman"/>
+      <w:lvlText w:val="%6."/>
+      <w:lvlJc w:val="right"/>
+      <w:pPr>
+        <w:ind w:left="4005" w:hanging="180"/>
+      </w:pPr>
+    </w:lvl>
+    <w:lvl w:ilvl="6" w:tplc="FFFFFFFF" w:tentative="1">
+      <w:start w:val="1"/>
+      <w:numFmt w:val="decimal"/>
+      <w:lvlText w:val="%7."/>
+      <w:lvlJc w:val="left"/>
+      <w:pPr>
+        <w:ind w:left="4725" w:hanging="360"/>
+      </w:pPr>
+    </w:lvl>
+    <w:lvl w:ilvl="7" w:tplc="FFFFFFFF" w:tentative="1">
+      <w:start w:val="1"/>
+      <w:numFmt w:val="lowerLetter"/>
+      <w:lvlText w:val="%8."/>
+      <w:lvlJc w:val="left"/>
+      <w:pPr>
+        <w:ind w:left="5445" w:hanging="360"/>
+      </w:pPr>
+    </w:lvl>
+    <w:lvl w:ilvl="8" w:tplc="FFFFFFFF" w:tentative="1">
+      <w:start w:val="1"/>
+      <w:numFmt w:val="lowerRoman"/>
+      <w:lvlText w:val="%9."/>
+      <w:lvlJc w:val="right"/>
+      <w:pPr>
+        <w:ind w:left="6165" w:hanging="180"/>
+      </w:pPr>
+    </w:lvl>
+  </w:abstractNum>
+  <w:abstractNum w:abstractNumId="5" w15:restartNumberingAfterBreak="0">
     <w:nsid w:val="3A923EF0"/>
     <w:multiLevelType w:val="hybridMultilevel"/>
     <w:tmpl w:val="A5B825A2"/>
@@ -8700,7 +7897,7 @@
       </w:rPr>
     </w:lvl>
   </w:abstractNum>
-  <w:abstractNum w:abstractNumId="5" w15:restartNumberingAfterBreak="0">
+  <w:abstractNum w:abstractNumId="6" w15:restartNumberingAfterBreak="0">
     <w:nsid w:val="4258595E"/>
     <w:multiLevelType w:val="multilevel"/>
     <w:tmpl w:val="68805932"/>
@@ -8849,7 +8046,7 @@
       </w:rPr>
     </w:lvl>
   </w:abstractNum>
-  <w:abstractNum w:abstractNumId="6" w15:restartNumberingAfterBreak="0">
+  <w:abstractNum w:abstractNumId="7" w15:restartNumberingAfterBreak="0">
     <w:nsid w:val="4E71180A"/>
     <w:multiLevelType w:val="hybridMultilevel"/>
     <w:tmpl w:val="9DB477EA"/>
@@ -8938,7 +8135,7 @@
       </w:pPr>
     </w:lvl>
   </w:abstractNum>
-  <w:abstractNum w:abstractNumId="7" w15:restartNumberingAfterBreak="0">
+  <w:abstractNum w:abstractNumId="8" w15:restartNumberingAfterBreak="0">
     <w:nsid w:val="58381389"/>
     <w:multiLevelType w:val="hybridMultilevel"/>
     <w:tmpl w:val="56489F34"/>
@@ -9027,7 +8224,7 @@
       </w:pPr>
     </w:lvl>
   </w:abstractNum>
-  <w:abstractNum w:abstractNumId="8" w15:restartNumberingAfterBreak="0">
+  <w:abstractNum w:abstractNumId="9" w15:restartNumberingAfterBreak="0">
     <w:nsid w:val="770B2AED"/>
     <w:multiLevelType w:val="hybridMultilevel"/>
     <w:tmpl w:val="E334FAA2"/>
@@ -9140,7 +8337,120 @@
       </w:rPr>
     </w:lvl>
   </w:abstractNum>
-  <w:abstractNum w:abstractNumId="9" w15:restartNumberingAfterBreak="0">
+  <w:abstractNum w:abstractNumId="10" w15:restartNumberingAfterBreak="0">
+    <w:nsid w:val="78D600FF"/>
+    <w:multiLevelType w:val="multilevel"/>
+    <w:tmpl w:val="D1288E6C"/>
+    <w:lvl w:ilvl="0">
+      <w:start w:val="1"/>
+      <w:numFmt w:val="decimal"/>
+      <w:lvlText w:val="%1."/>
+      <w:lvlJc w:val="left"/>
+      <w:pPr>
+        <w:tabs>
+          <w:tab w:val="num" w:pos="720"/>
+        </w:tabs>
+        <w:ind w:left="720" w:hanging="360"/>
+      </w:pPr>
+    </w:lvl>
+    <w:lvl w:ilvl="1" w:tentative="1">
+      <w:start w:val="1"/>
+      <w:numFmt w:val="decimal"/>
+      <w:lvlText w:val="%2."/>
+      <w:lvlJc w:val="left"/>
+      <w:pPr>
+        <w:tabs>
+          <w:tab w:val="num" w:pos="1440"/>
+        </w:tabs>
+        <w:ind w:left="1440" w:hanging="360"/>
+      </w:pPr>
+    </w:lvl>
+    <w:lvl w:ilvl="2" w:tentative="1">
+      <w:start w:val="1"/>
+      <w:numFmt w:val="decimal"/>
+      <w:lvlText w:val="%3."/>
+      <w:lvlJc w:val="left"/>
+      <w:pPr>
+        <w:tabs>
+          <w:tab w:val="num" w:pos="2160"/>
+        </w:tabs>
+        <w:ind w:left="2160" w:hanging="360"/>
+      </w:pPr>
+    </w:lvl>
+    <w:lvl w:ilvl="3" w:tentative="1">
+      <w:start w:val="1"/>
+      <w:numFmt w:val="decimal"/>
+      <w:lvlText w:val="%4."/>
+      <w:lvlJc w:val="left"/>
+      <w:pPr>
+        <w:tabs>
+          <w:tab w:val="num" w:pos="2880"/>
+        </w:tabs>
+        <w:ind w:left="2880" w:hanging="360"/>
+      </w:pPr>
+    </w:lvl>
+    <w:lvl w:ilvl="4" w:tentative="1">
+      <w:start w:val="1"/>
+      <w:numFmt w:val="decimal"/>
+      <w:lvlText w:val="%5."/>
+      <w:lvlJc w:val="left"/>
+      <w:pPr>
+        <w:tabs>
+          <w:tab w:val="num" w:pos="3600"/>
+        </w:tabs>
+        <w:ind w:left="3600" w:hanging="360"/>
+      </w:pPr>
+    </w:lvl>
+    <w:lvl w:ilvl="5" w:tentative="1">
+      <w:start w:val="1"/>
+      <w:numFmt w:val="decimal"/>
+      <w:lvlText w:val="%6."/>
+      <w:lvlJc w:val="left"/>
+      <w:pPr>
+        <w:tabs>
+          <w:tab w:val="num" w:pos="4320"/>
+        </w:tabs>
+        <w:ind w:left="4320" w:hanging="360"/>
+      </w:pPr>
+    </w:lvl>
+    <w:lvl w:ilvl="6" w:tentative="1">
+      <w:start w:val="1"/>
+      <w:numFmt w:val="decimal"/>
+      <w:lvlText w:val="%7."/>
+      <w:lvlJc w:val="left"/>
+      <w:pPr>
+        <w:tabs>
+          <w:tab w:val="num" w:pos="5040"/>
+        </w:tabs>
+        <w:ind w:left="5040" w:hanging="360"/>
+      </w:pPr>
+    </w:lvl>
+    <w:lvl w:ilvl="7" w:tentative="1">
+      <w:start w:val="1"/>
+      <w:numFmt w:val="decimal"/>
+      <w:lvlText w:val="%8."/>
+      <w:lvlJc w:val="left"/>
+      <w:pPr>
+        <w:tabs>
+          <w:tab w:val="num" w:pos="5760"/>
+        </w:tabs>
+        <w:ind w:left="5760" w:hanging="360"/>
+      </w:pPr>
+    </w:lvl>
+    <w:lvl w:ilvl="8" w:tentative="1">
+      <w:start w:val="1"/>
+      <w:numFmt w:val="decimal"/>
+      <w:lvlText w:val="%9."/>
+      <w:lvlJc w:val="left"/>
+      <w:pPr>
+        <w:tabs>
+          <w:tab w:val="num" w:pos="6480"/>
+        </w:tabs>
+        <w:ind w:left="6480" w:hanging="360"/>
+      </w:pPr>
+    </w:lvl>
+  </w:abstractNum>
+  <w:abstractNum w:abstractNumId="11" w15:restartNumberingAfterBreak="0">
     <w:nsid w:val="7BE67E43"/>
     <w:multiLevelType w:val="hybridMultilevel"/>
     <w:tmpl w:val="4F446838"/>
@@ -9254,7 +8564,7 @@
     </w:lvl>
   </w:abstractNum>
   <w:num w:numId="1" w16cid:durableId="1995210616">
-    <w:abstractNumId w:val="6"/>
+    <w:abstractNumId w:val="7"/>
   </w:num>
   <w:num w:numId="2" w16cid:durableId="1510365078">
     <w:abstractNumId w:val="3"/>
@@ -9263,13 +8573,13 @@
     <w:abstractNumId w:val="2"/>
   </w:num>
   <w:num w:numId="4" w16cid:durableId="1045134569">
-    <w:abstractNumId w:val="4"/>
+    <w:abstractNumId w:val="5"/>
   </w:num>
   <w:num w:numId="5" w16cid:durableId="1167330143">
-    <w:abstractNumId w:val="9"/>
+    <w:abstractNumId w:val="11"/>
   </w:num>
   <w:num w:numId="6" w16cid:durableId="2061400478">
-    <w:abstractNumId w:val="8"/>
+    <w:abstractNumId w:val="9"/>
   </w:num>
   <w:num w:numId="7" w16cid:durableId="1402633030">
     <w:abstractNumId w:val="1"/>
@@ -9278,10 +8588,16 @@
     <w:abstractNumId w:val="0"/>
   </w:num>
   <w:num w:numId="9" w16cid:durableId="205677">
-    <w:abstractNumId w:val="7"/>
+    <w:abstractNumId w:val="8"/>
   </w:num>
   <w:num w:numId="10" w16cid:durableId="866602929">
-    <w:abstractNumId w:val="5"/>
+    <w:abstractNumId w:val="6"/>
+  </w:num>
+  <w:num w:numId="11" w16cid:durableId="1985236847">
+    <w:abstractNumId w:val="4"/>
+  </w:num>
+  <w:num w:numId="12" w16cid:durableId="496960929">
+    <w:abstractNumId w:val="10"/>
   </w:num>
 </w:numbering>
 </file>

</xml_diff>